<commit_message>
Add institutional email; check OpenAlex alongside ORCID for new works
Co-Authored-By: Claude Opus 5.5 <noreply@anthropic.com>
</commit_message>
<xml_diff>
--- a/_private/Wilhan_Nunes_CV.docx
+++ b/_private/Wilhan_Nunes_CV.docx
@@ -44,6 +44,23 @@
           <w:i w:val="0"/>
           <w:color w:val="6B6B72"/>
         </w:rPr>
+        <w:t xml:space="preserve">  ·  </w:t>
+      </w:r>
+      <w:hyperlink r:id="rId11">
+        <w:r>
+          <w:rPr>
+            <w:rStyle w:val="Hyperlink"/>
+            <w:color w:val="1E5FA8"/>
+          </w:rPr>
+          <w:t xml:space="preserve">wdnunes@health.ucsd.edu</w:t>
+        </w:r>
+      </w:hyperlink>
+      <w:r>
+        <w:rPr>
+          <w:b w:val="0"/>
+          <w:i w:val="0"/>
+          <w:color w:val="6B6B72"/>
+        </w:rPr>
         <w:t xml:space="preserve">  ·  University of California, San Diego  ·  La Jolla, CA 92093</w:t>
       </w:r>
     </w:p>
@@ -57,7 +74,7 @@
         </w:rPr>
         <w:t xml:space="preserve">ORCID: </w:t>
       </w:r>
-      <w:hyperlink r:id="rId11">
+      <w:hyperlink r:id="rId12">
         <w:r>
           <w:rPr>
             <w:rStyle w:val="Hyperlink"/>
@@ -85,7 +102,7 @@
         </w:rPr>
         <w:t xml:space="preserve">Google Scholar: </w:t>
       </w:r>
-      <w:hyperlink r:id="rId12">
+      <w:hyperlink r:id="rId13">
         <w:r>
           <w:rPr>
             <w:rStyle w:val="Hyperlink"/>
@@ -113,7 +130,7 @@
         </w:rPr>
         <w:t xml:space="preserve">LinkedIn: </w:t>
       </w:r>
-      <w:hyperlink r:id="rId13">
+      <w:hyperlink r:id="rId14">
         <w:r>
           <w:rPr>
             <w:rStyle w:val="Hyperlink"/>
@@ -1137,7 +1154,7 @@
       <w:r>
         <w:t xml:space="preserve"> </w:t>
       </w:r>
-      <w:hyperlink r:id="rId14">
+      <w:hyperlink r:id="rId15">
         <w:r>
           <w:rPr>
             <w:rStyle w:val="Hyperlink"/>
@@ -1247,7 +1264,7 @@
       <w:r>
         <w:t xml:space="preserve"> </w:t>
       </w:r>
-      <w:hyperlink r:id="rId15">
+      <w:hyperlink r:id="rId16">
         <w:r>
           <w:rPr>
             <w:rStyle w:val="Hyperlink"/>
@@ -1357,7 +1374,7 @@
       <w:r>
         <w:t xml:space="preserve"> </w:t>
       </w:r>
-      <w:hyperlink r:id="rId16">
+      <w:hyperlink r:id="rId17">
         <w:r>
           <w:rPr>
             <w:rStyle w:val="Hyperlink"/>
@@ -1467,7 +1484,7 @@
       <w:r>
         <w:t xml:space="preserve"> </w:t>
       </w:r>
-      <w:hyperlink r:id="rId17">
+      <w:hyperlink r:id="rId18">
         <w:r>
           <w:rPr>
             <w:rStyle w:val="Hyperlink"/>
@@ -1577,7 +1594,7 @@
       <w:r>
         <w:t xml:space="preserve"> </w:t>
       </w:r>
-      <w:hyperlink r:id="rId18">
+      <w:hyperlink r:id="rId19">
         <w:r>
           <w:rPr>
             <w:rStyle w:val="Hyperlink"/>
@@ -1687,7 +1704,7 @@
       <w:r>
         <w:t xml:space="preserve"> </w:t>
       </w:r>
-      <w:hyperlink r:id="rId19">
+      <w:hyperlink r:id="rId20">
         <w:r>
           <w:rPr>
             <w:rStyle w:val="Hyperlink"/>
@@ -1788,7 +1805,7 @@
       <w:r>
         <w:t xml:space="preserve"> </w:t>
       </w:r>
-      <w:hyperlink r:id="rId20">
+      <w:hyperlink r:id="rId21">
         <w:r>
           <w:rPr>
             <w:rStyle w:val="Hyperlink"/>
@@ -1889,7 +1906,7 @@
       <w:r>
         <w:t xml:space="preserve"> </w:t>
       </w:r>
-      <w:hyperlink r:id="rId21">
+      <w:hyperlink r:id="rId22">
         <w:r>
           <w:rPr>
             <w:rStyle w:val="Hyperlink"/>
@@ -1999,7 +2016,7 @@
       <w:r>
         <w:t xml:space="preserve"> </w:t>
       </w:r>
-      <w:hyperlink r:id="rId22">
+      <w:hyperlink r:id="rId23">
         <w:r>
           <w:rPr>
             <w:rStyle w:val="Hyperlink"/>
@@ -2082,7 +2099,7 @@
       <w:r>
         <w:t xml:space="preserve"> </w:t>
       </w:r>
-      <w:hyperlink r:id="rId23">
+      <w:hyperlink r:id="rId24">
         <w:r>
           <w:rPr>
             <w:rStyle w:val="Hyperlink"/>
@@ -2192,7 +2209,7 @@
       <w:r>
         <w:t xml:space="preserve"> </w:t>
       </w:r>
-      <w:hyperlink r:id="rId24">
+      <w:hyperlink r:id="rId25">
         <w:r>
           <w:rPr>
             <w:rStyle w:val="Hyperlink"/>
@@ -2293,7 +2310,7 @@
       <w:r>
         <w:t xml:space="preserve"> </w:t>
       </w:r>
-      <w:hyperlink r:id="rId25">
+      <w:hyperlink r:id="rId26">
         <w:r>
           <w:rPr>
             <w:rStyle w:val="Hyperlink"/>
@@ -2394,7 +2411,7 @@
       <w:r>
         <w:t xml:space="preserve"> </w:t>
       </w:r>
-      <w:hyperlink r:id="rId26">
+      <w:hyperlink r:id="rId27">
         <w:r>
           <w:rPr>
             <w:rStyle w:val="Hyperlink"/>
@@ -2504,7 +2521,7 @@
       <w:r>
         <w:t xml:space="preserve"> </w:t>
       </w:r>
-      <w:hyperlink r:id="rId27">
+      <w:hyperlink r:id="rId28">
         <w:r>
           <w:rPr>
             <w:rStyle w:val="Hyperlink"/>
@@ -2605,7 +2622,7 @@
       <w:r>
         <w:t xml:space="preserve"> </w:t>
       </w:r>
-      <w:hyperlink r:id="rId28">
+      <w:hyperlink r:id="rId29">
         <w:r>
           <w:rPr>
             <w:rStyle w:val="Hyperlink"/>
@@ -2715,7 +2732,7 @@
       <w:r>
         <w:t xml:space="preserve"> </w:t>
       </w:r>
-      <w:hyperlink r:id="rId29">
+      <w:hyperlink r:id="rId30">
         <w:r>
           <w:rPr>
             <w:rStyle w:val="Hyperlink"/>
@@ -2825,7 +2842,7 @@
       <w:r>
         <w:t xml:space="preserve"> </w:t>
       </w:r>
-      <w:hyperlink r:id="rId30">
+      <w:hyperlink r:id="rId31">
         <w:r>
           <w:rPr>
             <w:rStyle w:val="Hyperlink"/>
@@ -2917,7 +2934,7 @@
       <w:r>
         <w:t xml:space="preserve"> </w:t>
       </w:r>
-      <w:hyperlink r:id="rId31">
+      <w:hyperlink r:id="rId32">
         <w:r>
           <w:rPr>
             <w:rStyle w:val="Hyperlink"/>
@@ -3027,7 +3044,7 @@
       <w:r>
         <w:t xml:space="preserve"> </w:t>
       </w:r>
-      <w:hyperlink r:id="rId32">
+      <w:hyperlink r:id="rId33">
         <w:r>
           <w:rPr>
             <w:rStyle w:val="Hyperlink"/>
@@ -3128,7 +3145,7 @@
       <w:r>
         <w:t xml:space="preserve"> </w:t>
       </w:r>
-      <w:hyperlink r:id="rId33">
+      <w:hyperlink r:id="rId34">
         <w:r>
           <w:rPr>
             <w:rStyle w:val="Hyperlink"/>
@@ -3238,7 +3255,7 @@
       <w:r>
         <w:t xml:space="preserve"> </w:t>
       </w:r>
-      <w:hyperlink r:id="rId34">
+      <w:hyperlink r:id="rId35">
         <w:r>
           <w:rPr>
             <w:rStyle w:val="Hyperlink"/>
@@ -3348,7 +3365,7 @@
       <w:r>
         <w:t xml:space="preserve"> </w:t>
       </w:r>
-      <w:hyperlink r:id="rId35">
+      <w:hyperlink r:id="rId36">
         <w:r>
           <w:rPr>
             <w:rStyle w:val="Hyperlink"/>
@@ -3458,7 +3475,7 @@
       <w:r>
         <w:t xml:space="preserve"> </w:t>
       </w:r>
-      <w:hyperlink r:id="rId36">
+      <w:hyperlink r:id="rId37">
         <w:r>
           <w:rPr>
             <w:rStyle w:val="Hyperlink"/>
@@ -3568,7 +3585,7 @@
       <w:r>
         <w:t xml:space="preserve"> </w:t>
       </w:r>
-      <w:hyperlink r:id="rId37">
+      <w:hyperlink r:id="rId38">
         <w:r>
           <w:rPr>
             <w:rStyle w:val="Hyperlink"/>
@@ -3669,7 +3686,7 @@
       <w:r>
         <w:t xml:space="preserve"> </w:t>
       </w:r>
-      <w:hyperlink r:id="rId38">
+      <w:hyperlink r:id="rId39">
         <w:r>
           <w:rPr>
             <w:rStyle w:val="Hyperlink"/>
@@ -3779,7 +3796,7 @@
       <w:r>
         <w:t xml:space="preserve"> </w:t>
       </w:r>
-      <w:hyperlink r:id="rId39">
+      <w:hyperlink r:id="rId40">
         <w:r>
           <w:rPr>
             <w:rStyle w:val="Hyperlink"/>
@@ -3899,7 +3916,7 @@
       <w:r>
         <w:t xml:space="preserve"> </w:t>
       </w:r>
-      <w:hyperlink r:id="rId40">
+      <w:hyperlink r:id="rId41">
         <w:r>
           <w:rPr>
             <w:rStyle w:val="Hyperlink"/>
@@ -4009,7 +4026,7 @@
       <w:r>
         <w:t xml:space="preserve"> </w:t>
       </w:r>
-      <w:hyperlink r:id="rId41">
+      <w:hyperlink r:id="rId42">
         <w:r>
           <w:rPr>
             <w:rStyle w:val="Hyperlink"/>
@@ -4119,7 +4136,7 @@
       <w:r>
         <w:t xml:space="preserve"> </w:t>
       </w:r>
-      <w:hyperlink r:id="rId42">
+      <w:hyperlink r:id="rId43">
         <w:r>
           <w:rPr>
             <w:rStyle w:val="Hyperlink"/>
@@ -4229,7 +4246,7 @@
       <w:r>
         <w:t xml:space="preserve"> </w:t>
       </w:r>
-      <w:hyperlink r:id="rId43">
+      <w:hyperlink r:id="rId44">
         <w:r>
           <w:rPr>
             <w:rStyle w:val="Hyperlink"/>
@@ -4339,7 +4356,7 @@
       <w:r>
         <w:t xml:space="preserve"> </w:t>
       </w:r>
-      <w:hyperlink r:id="rId44">
+      <w:hyperlink r:id="rId45">
         <w:r>
           <w:rPr>
             <w:rStyle w:val="Hyperlink"/>
@@ -4449,7 +4466,7 @@
       <w:r>
         <w:t xml:space="preserve"> </w:t>
       </w:r>
-      <w:hyperlink r:id="rId45">
+      <w:hyperlink r:id="rId46">
         <w:r>
           <w:rPr>
             <w:rStyle w:val="Hyperlink"/>
@@ -4559,7 +4576,7 @@
       <w:r>
         <w:t xml:space="preserve"> </w:t>
       </w:r>
-      <w:hyperlink r:id="rId46">
+      <w:hyperlink r:id="rId47">
         <w:r>
           <w:rPr>
             <w:rStyle w:val="Hyperlink"/>
@@ -4669,7 +4686,7 @@
       <w:r>
         <w:t xml:space="preserve"> </w:t>
       </w:r>
-      <w:hyperlink r:id="rId47">
+      <w:hyperlink r:id="rId48">
         <w:r>
           <w:rPr>
             <w:rStyle w:val="Hyperlink"/>

</xml_diff>

<commit_message>
Fix CI: parse non-standard bib months, serialize builds, drop rejected abstract
- doi.org wrote month=Sept, an undefined BibTeX macro that crashed build_site.py
- concurrent builds raced on git push; add a concurrency group and rebase before pushing
- remove the Gastroenterology abstract .bib that was rejected via ignored_dois.txt

Co-Authored-By: Claude Opus 5.5 <noreply@anthropic.com>
</commit_message>
<xml_diff>
--- a/_private/Wilhan_Nunes_CV.docx
+++ b/_private/Wilhan_Nunes_CV.docx
@@ -1042,7 +1042,7 @@
           <w:color w:val="6B6B72"/>
           <w:sz w:val="19"/>
         </w:rPr>
-        <w:t>26 peer-reviewed articles · 8 preprints · 6 as first author. Own name in bold.</w:t>
+        <w:t>26 peer-reviewed articles · 9 preprints · 6 as first author. Own name in bold.</w:t>
       </w:r>
     </w:p>
     <w:p>
@@ -3830,7 +3830,7 @@
         <w:rPr>
           <w:color w:val="6B6B72"/>
         </w:rPr>
-        <w:t>8.</w:t>
+        <w:t>9.</w:t>
         <w:tab/>
       </w:r>
       <w:r>
@@ -3940,7 +3940,7 @@
         <w:rPr>
           <w:color w:val="6B6B72"/>
         </w:rPr>
-        <w:t>7.</w:t>
+        <w:t>8.</w:t>
         <w:tab/>
       </w:r>
       <w:r>
@@ -4050,6 +4050,116 @@
         <w:rPr>
           <w:color w:val="6B6B72"/>
         </w:rPr>
+        <w:t>7.</w:t>
+        <w:tab/>
+      </w:r>
+      <w:r>
+        <w:rPr>
+          <w:b w:val="0"/>
+        </w:rPr>
+        <w:t>Gouda H.</w:t>
+      </w:r>
+      <w:r>
+        <w:t xml:space="preserve">, </w:t>
+      </w:r>
+      <w:r>
+        <w:rPr>
+          <w:b w:val="0"/>
+        </w:rPr>
+        <w:t>Kelly P.</w:t>
+      </w:r>
+      <w:r>
+        <w:t xml:space="preserve">, </w:t>
+      </w:r>
+      <w:r>
+        <w:rPr>
+          <w:b w:val="0"/>
+        </w:rPr>
+        <w:t>Whiley L.</w:t>
+      </w:r>
+      <w:r>
+        <w:t xml:space="preserve">, </w:t>
+      </w:r>
+      <w:r>
+        <w:rPr>
+          <w:b w:val="0"/>
+        </w:rPr>
+        <w:t>Gómez-Pérez D.</w:t>
+      </w:r>
+      <w:r>
+        <w:t xml:space="preserve">, </w:t>
+      </w:r>
+      <w:r>
+        <w:rPr>
+          <w:b w:val="0"/>
+        </w:rPr>
+        <w:t>Mascellani Bergo A.</w:t>
+      </w:r>
+      <w:r>
+        <w:t xml:space="preserve">, </w:t>
+      </w:r>
+      <w:r>
+        <w:rPr>
+          <w:b/>
+        </w:rPr>
+        <w:t>Gonçalves Nunes W.D.</w:t>
+      </w:r>
+      <w:r>
+        <w:t xml:space="preserve">, </w:t>
+      </w:r>
+      <w:r>
+        <w:rPr>
+          <w:b w:val="0"/>
+        </w:rPr>
+        <w:t>et al.</w:t>
+      </w:r>
+      <w:r>
+        <w:t xml:space="preserve"> </w:t>
+      </w:r>
+      <w:r>
+        <w:rPr>
+          <w:b w:val="0"/>
+          <w:i w:val="0"/>
+        </w:rPr>
+        <w:t xml:space="preserve">Widespread detection of Polyethylene glycol reveals chronic human exposure through pharmaceutical drugs. </w:t>
+      </w:r>
+      <w:r>
+        <w:rPr>
+          <w:b w:val="0"/>
+          <w:i/>
+        </w:rPr>
+        <w:t>bioRxiv</w:t>
+      </w:r>
+      <w:r>
+        <w:t xml:space="preserve"> (2026).</w:t>
+      </w:r>
+      <w:r>
+        <w:t xml:space="preserve"> </w:t>
+      </w:r>
+      <w:hyperlink r:id="rId43">
+        <w:r>
+          <w:rPr>
+            <w:rStyle w:val="Hyperlink"/>
+            <w:color w:val="1E5FA8"/>
+            <w:u w:val="single"/>
+          </w:rPr>
+          <w:t xml:space="preserve">doi:10.64898/2026.09.11.750999</w:t>
+        </w:r>
+      </w:hyperlink>
+    </w:p>
+    <w:p>
+      <w:pPr>
+        <w:keepLines/>
+        <w:tabs>
+          <w:tab w:pos="454" w:val="left"/>
+        </w:tabs>
+        <w:spacing w:before="20" w:after="80"/>
+        <w:ind w:left="454" w:hanging="454"/>
+      </w:pPr>
+      <w:r>
+        <w:rPr>
+          <w:color w:val="6B6B72"/>
+        </w:rPr>
         <w:t>6.</w:t>
         <w:tab/>
       </w:r>
@@ -4136,7 +4246,7 @@
       <w:r>
         <w:t xml:space="preserve"> </w:t>
       </w:r>
-      <w:hyperlink r:id="rId43">
+      <w:hyperlink r:id="rId44">
         <w:r>
           <w:rPr>
             <w:rStyle w:val="Hyperlink"/>
@@ -4246,7 +4356,7 @@
       <w:r>
         <w:t xml:space="preserve"> </w:t>
       </w:r>
-      <w:hyperlink r:id="rId44">
+      <w:hyperlink r:id="rId45">
         <w:r>
           <w:rPr>
             <w:rStyle w:val="Hyperlink"/>
@@ -4356,7 +4466,7 @@
       <w:r>
         <w:t xml:space="preserve"> </w:t>
       </w:r>
-      <w:hyperlink r:id="rId45">
+      <w:hyperlink r:id="rId46">
         <w:r>
           <w:rPr>
             <w:rStyle w:val="Hyperlink"/>
@@ -4466,7 +4576,7 @@
       <w:r>
         <w:t xml:space="preserve"> </w:t>
       </w:r>
-      <w:hyperlink r:id="rId46">
+      <w:hyperlink r:id="rId47">
         <w:r>
           <w:rPr>
             <w:rStyle w:val="Hyperlink"/>
@@ -4576,7 +4686,7 @@
       <w:r>
         <w:t xml:space="preserve"> </w:t>
       </w:r>
-      <w:hyperlink r:id="rId47">
+      <w:hyperlink r:id="rId48">
         <w:r>
           <w:rPr>
             <w:rStyle w:val="Hyperlink"/>
@@ -4686,7 +4796,7 @@
       <w:r>
         <w:t xml:space="preserve"> </w:t>
       </w:r>
-      <w:hyperlink r:id="rId48">
+      <w:hyperlink r:id="rId49">
         <w:r>
           <w:rPr>
             <w:rStyle w:val="Hyperlink"/>

</xml_diff>